<commit_message>
courseware: teach Copilot workflows and agents with business outcomes
</commit_message>
<xml_diff>
--- a/courseware/AP-AI-Transformation-with-Microsoft-Copilot.docx
+++ b/courseware/AP-AI-Transformation-with-Microsoft-Copilot.docx
@@ -56,7 +56,7 @@
     </w:p>
     <w:p>
       <w:r>
-        <w:t>TGS-2024044051  •  v2.0  •  27 September 2026  •  WSQ  •  3 days / 24 hours</w:t>
+        <w:t>TGS-2024044051  •  v3.0  •  28 September 2026  •  WSQ  •  3 days / 24 hours</w:t>
       </w:r>
     </w:p>
     <w:p>
@@ -301,7 +301,7 @@
           </w:tcPr>
           <w:p>
             <w:r>
-              <w:t>A1–A2 · mandate and implementation plan</w:t>
+              <w:t>A1–A2 · business-use artifact and pilot plan</w:t>
             </w:r>
           </w:p>
         </w:tc>
@@ -333,7 +333,7 @@
           </w:tcPr>
           <w:p>
             <w:r>
-              <w:t>A3 · responsible-use and control charter</w:t>
+              <w:t>A3 · workflow design and control card</w:t>
             </w:r>
           </w:p>
         </w:tc>
@@ -355,7 +355,7 @@
           </w:tcPr>
           <w:p>
             <w:r>
-              <w:t>K3 · use-as-is, extend or build trade-offs</w:t>
+              <w:t>K3 · agent purpose, instructions, knowledge, tests and sharing</w:t>
             </w:r>
           </w:p>
         </w:tc>
@@ -365,7 +365,7 @@
           </w:tcPr>
           <w:p>
             <w:r>
-              <w:t>A4 · integration decision and workflow test</w:t>
+              <w:t>A4 · agent design and test record</w:t>
             </w:r>
           </w:p>
         </w:tc>
@@ -416,7 +416,7 @@
         <w:pStyle w:val="ListBullet"/>
       </w:pPr>
       <w:r>
-        <w:t>Confirm candidate identity and issue only the current v2.0 WA/PP candidate papers. Keep answer keys and assessor decisions outside public learner locations.</w:t>
+        <w:t>Confirm candidate identity and issue only the current v3.0 WA/PP candidate papers. Keep answer keys and assessor decisions outside public learner locations.</w:t>
       </w:r>
     </w:p>
     <w:p>
@@ -498,7 +498,7 @@
     </w:p>
     <w:p>
       <w:r>
-        <w:t>Use the v2.0 Trainer Slides, Learner Guide, Lesson Plan and ten executive labs for instruction. The WA and PP candidate papers are the only learner-facing assessment instruments; marking guides are assessor-only.</w:t>
+        <w:t>Use the v3.0 Trainer Slides, Learner Guide, Lesson Plan and ten executive labs for instruction. The WA and PP candidate papers are the only learner-facing assessment instruments; marking guides are assessor-only.</w:t>
       </w:r>
     </w:p>
     <w:sectPr>

</xml_diff>